<commit_message>
Fix equation-documentation bugs (TC, robustness Jaccard denominator), add Efron 1979 bootstrap citation
</commit_message>
<xml_diff>
--- a/submission/manuscript.docx
+++ b/submission/manuscript.docx
@@ -2299,7 +2299,23 @@
         <w:t xml:space="preserve"> </w:t>
       </w:r>
       <w:r>
-        <w:t xml:space="preserve">measures the rank-correlation stability of feature attributions across a sliding window of</w:t>
+        <w:t xml:space="preserve">measures the rank-correlation stability of feature attributions across the explained batch, treated as a proxy sliding window of behaviorally adjacent samples (e.g., consecutive flows from the same source in a live deployment), rather than a per-sample quantity:</w:t>
+      </w:r>
+    </w:p>
+    <w:p>
+      <w:pPr>
+        <w:pStyle w:val="BodyText"/>
+      </w:pPr>
+      <w:r>
+        <w:t xml:space="preserve">TC = clip( (ρ̄ + 1) / 2, 0, 1 ), where ρ̄ = (1 / (N − 1)) · Σ_{i=1}^{N-1} ρ_Spearman(φ(x_i), φ(x_{i+1})),</w:t>
+      </w:r>
+    </w:p>
+    <w:p>
+      <w:pPr>
+        <w:pStyle w:val="BodyText"/>
+      </w:pPr>
+      <w:r>
+        <w:t xml:space="preserve">for the</w:t>
       </w:r>
       <w:r>
         <w:t xml:space="preserve"> </w:t>
@@ -2309,29 +2325,25 @@
           <w:i/>
           <w:iCs/>
         </w:rPr>
-        <w:t xml:space="preserve">k</w:t>
-      </w:r>
-      <w:r>
-        <w:t xml:space="preserve"> </w:t>
-      </w:r>
-      <w:r>
-        <w:t xml:space="preserve">nearest neighbors in feature space for each explained sample:</w:t>
-      </w:r>
-    </w:p>
-    <w:p>
-      <w:pPr>
-        <w:pStyle w:val="BodyText"/>
-      </w:pPr>
-      <w:r>
-        <w:t xml:space="preserve">TC(x) = (1 / k) · Σ_{x’ in N_k(x)} ρ_Spearman(φ(x), φ(x’)),</w:t>
-      </w:r>
-    </w:p>
-    <w:p>
-      <w:pPr>
-        <w:pStyle w:val="BodyText"/>
-      </w:pPr>
-      <w:r>
-        <w:t xml:space="preserve">as a proxy for whether explanations</w:t>
+        <w:t xml:space="preserve">N</w:t>
+      </w:r>
+      <w:r>
+        <w:t xml:space="preserve"> </w:t>
+      </w:r>
+      <w:r>
+        <w:t xml:space="preserve">explained samples x_1, …, x_N in the order they were drawn, mapping the mean pairwise Spearman correlation from [−1, 1] to [0, 1] so that, consistent with every other metric in this paper, higher is better. We report one TC value per (explainer, model, tier) cell rather than per sample. This is a deliberate proxy, not a literal temporal ordering: the datasets used here (Section 3.1) are not temporally ordered flow sequences, so</w:t>
+      </w:r>
+      <w:r>
+        <w:t xml:space="preserve"> </w:t>
+      </w:r>
+      <w:r>
+        <w:t xml:space="preserve">“adjacent”</w:t>
+      </w:r>
+      <w:r>
+        <w:t xml:space="preserve"> </w:t>
+      </w:r>
+      <w:r>
+        <w:t xml:space="preserve">means adjacent in the explained-sample draw order, not adjacent in real time or in feature-space distance; a genuine temporal or nearest-neighbor-based TC is noted as future work (Section 5.5). As a proxy for whether explanations</w:t>
       </w:r>
       <w:r>
         <w:t xml:space="preserve"> </w:t>
@@ -2343,7 +2355,7 @@
         <w:t xml:space="preserve"> </w:t>
       </w:r>
       <w:r>
-        <w:t xml:space="preserve">between near-identical inputs, itself a form of the instability CC-SHAP is designed to reduce.</w:t>
+        <w:t xml:space="preserve">between similar inputs, it is itself a form of the instability CC-SHAP is designed to reduce.</w:t>
       </w:r>
     </w:p>
     <w:p>
@@ -2382,7 +2394,7 @@
         <w:pStyle w:val="BodyText"/>
       </w:pPr>
       <w:r>
-        <w:t xml:space="preserve">ROB_ε(x) = |top_k(φ(x)) ∩ top_k(φ(x + δ_ε))| / k,</w:t>
+        <w:t xml:space="preserve">ROB_ε(x) = |top_k(φ(x)) ∩ top_k(φ(x + δ_ε))| / |top_k(φ(x)) ∪ top_k(φ(x + δ_ε))|,</w:t>
       </w:r>
     </w:p>
     <w:p>
@@ -2500,7 +2512,7 @@
         <w:t xml:space="preserve"> </w:t>
       </w:r>
       <w:r>
-        <w:t xml:space="preserve">is the fraction of near-zero attributions in φ(x) (below a small fixed threshold relative to the maximum attribution magnitude for that sample), averaged across the batch; a higher value means fewer features carry the operator-visible explanation burden.</w:t>
+        <w:t xml:space="preserve">is the fraction of near-zero attributions in φ(x) (|φ_j(x)| &lt; 10⁻³, a small fixed absolute threshold), averaged across the batch; a higher value means fewer features carry the operator-visible explanation burden.</w:t>
       </w:r>
     </w:p>
     <w:p>
@@ -7402,7 +7414,7 @@
         <w:t xml:space="preserve"> </w:t>
       </w:r>
       <w:r>
-        <w:t xml:space="preserve">= 100 explained samples per dataset, matching the main results) designed to isolate this question.</w:t>
+        <w:t xml:space="preserve">= 100 explained samples per dataset, matching the main results) designed to isolate this question. All confidence intervals in this section use the nonparametric percentile bootstrap [48] (1,000 resamples with replacement over the explained-sample batch).</w:t>
       </w:r>
     </w:p>
     <w:p>
@@ -8533,7 +8545,7 @@
         <w:pStyle w:val="FirstParagraph"/>
       </w:pPr>
       <w:r>
-        <w:t xml:space="preserve">Natural extensions include: testing CC-SHAP against unbounded PC/FCI causal discovery to quantify what the conditioning-set bound costs in missed structure; combining the significance test with an effect-size floor (rather than either alone) so the production-scale skeleton does not collapse to a single clique, and re-running Sections 4.1–4.3 under that corrected skeleton to test whether the headline numbers change; directly testing why the Section 4.4 robustness effect of correlation-informed vs. random grouping reverses sign between the LightGBM/TreeSHAP and MLP/KernelSHAP sides, which this paper surfaces but does not explain; extending the causal base-explainer pairing to a differentiable-model-native method for the neural-network side; multi-seed replication with confidence intervals at full production scale (Section 4.4’s bootstrap CIs are a single-run, single-seed companion experiment, not a substitute); container-level (cgroup) resource-cap enforcement for literal hardware-budget claims; extending the cross-dataset generalization check to a third, protocol-diverse corpus to further stress-test the replication found here; evaluating CC-SHAP specifically against the sparsity-exploiting NonsaliencyCrossover-style attack [32] identified as a limitation above, rather than only against classifier-targeted FGSM/DeepFool/black-box attacks; and applying Dhaou’s feature-level leakage-screening protocol [23] to CICIoT2023 and Edge-IIoTset as a preregistered step prior to any future accuracy claim on either corpus, extending the row-level duplicate correction already applied here (Section 3.1) to the feature level.</w:t>
+        <w:t xml:space="preserve">Natural extensions include: replacing the current draw-order proxy for Temporal Coherence (Section 3.6) with a genuine temporal or feature-space-nearest-neighbor sliding window once a dataset with real flow ordering or session identifiers is available, since CICIoT2023 and Edge-IIoTset as released do not preserve the temporal structure the metric is ultimately meant to probe; testing CC-SHAP against unbounded PC/FCI causal discovery to quantify what the conditioning-set bound costs in missed structure; combining the significance test with an effect-size floor (rather than either alone) so the production-scale skeleton does not collapse to a single clique, and re-running Sections 4.1–4.3 under that corrected skeleton to test whether the headline numbers change; directly testing why the Section 4.4 robustness effect of correlation-informed vs. random grouping reverses sign between the LightGBM/TreeSHAP and MLP/KernelSHAP sides, which this paper surfaces but does not explain; extending the causal base-explainer pairing to a differentiable-model-native method for the neural-network side; multi-seed replication with confidence intervals at full production scale (Section 4.4’s bootstrap CIs are a single-run, single-seed companion experiment, not a substitute); container-level (cgroup) resource-cap enforcement for literal hardware-budget claims; extending the cross-dataset generalization check to a third, protocol-diverse corpus to further stress-test the replication found here; evaluating CC-SHAP specifically against the sparsity-exploiting NonsaliencyCrossover-style attack [32] identified as a limitation above, rather than only against classifier-targeted FGSM/DeepFool/black-box attacks; and applying Dhaou’s feature-level leakage-screening protocol [23] to CICIoT2023 and Edge-IIoTset as a preregistered step prior to any future accuracy claim on either corpus, extending the row-level duplicate correction already applied here (Section 3.1) to the feature level.</w:t>
       </w:r>
     </w:p>
     <w:p>
@@ -8602,7 +8614,7 @@
         <w:pStyle w:val="FirstParagraph"/>
       </w:pPr>
       <w:r>
-        <w:t xml:space="preserve">The datasets analyzed in this study are third-party, publicly available corpora: CICIoT2023 is available from the Canadian Institute for Cybersecurity at the University of New Brunswick (https://www.unb.ca/cic/datasets/iotdataset-2023.html); Edge-IIoTset is available from its original publication [10]. All experiment code, the data-loading and leakage-correction pipeline, trained-model configurations, and the full result CSVs and figures reported in this paper are released at [repository URL to be inserted upon submission].</w:t>
+        <w:t xml:space="preserve">The datasets analyzed in this study are third-party, publicly available corpora: CICIoT2023 is available from the Canadian Institute for Cybersecurity at the University of New Brunswick (https://www.unb.ca/cic/datasets/iotdataset-2023.html); Edge-IIoTset is available from its original publication [10]. All experiment code, the data-loading and leakage-correction pipeline, trained-model configurations, and the full result CSVs and figures reported in this paper are released at https://github.com/Ajay102456/cc-shap-iot-edge-xai.</w:t>
       </w:r>
     </w:p>
     <w:bookmarkEnd w:id="62"/>
@@ -11638,6 +11650,54 @@
       </w:r>
     </w:p>
     <w:p>
+      <w:pPr>
+        <w:pStyle w:val="Compact"/>
+        <w:numPr>
+          <w:ilvl w:val="0"/>
+          <w:numId w:val="1001"/>
+        </w:numPr>
+      </w:pPr>
+      <w:r>
+        <w:t xml:space="preserve">Efron, B. Bootstrap Methods: Another Look at the Jackknife.</w:t>
+      </w:r>
+      <w:r>
+        <w:t xml:space="preserve"> </w:t>
+      </w:r>
+      <w:r>
+        <w:rPr>
+          <w:i/>
+          <w:iCs/>
+        </w:rPr>
+        <w:t xml:space="preserve">Ann. Stat.</w:t>
+      </w:r>
+      <w:r>
+        <w:t xml:space="preserve"> </w:t>
+      </w:r>
+      <w:r>
+        <w:rPr>
+          <w:b/>
+          <w:bCs/>
+        </w:rPr>
+        <w:t xml:space="preserve">1979</w:t>
+      </w:r>
+      <w:r>
+        <w:t xml:space="preserve">,</w:t>
+      </w:r>
+      <w:r>
+        <w:t xml:space="preserve"> </w:t>
+      </w:r>
+      <w:r>
+        <w:rPr>
+          <w:i/>
+          <w:iCs/>
+        </w:rPr>
+        <w:t xml:space="preserve">7</w:t>
+      </w:r>
+      <w:r>
+        <w:t xml:space="preserve">, 1–26.</w:t>
+      </w:r>
+    </w:p>
+    <w:p>
       <w:r>
         <w:pict>
           <v:rect style="width:0;height:1.5pt" o:hralign="center" o:hrstd="t" o:hr="t"/>
@@ -11878,7 +11938,7 @@
         <w:t xml:space="preserve"> </w:t>
       </w:r>
       <w:r>
-        <w:t xml:space="preserve">47 references, cross-checked against the project’s local literature corpus (</w:t>
+        <w:t xml:space="preserve">48 references (47 plus Efron 1979 [48], added during paper-polishing to credit the bootstrap CI method introduced in Section 4.4), cross-checked against the project’s local literature corpus (</w:t>
       </w:r>
       <w:r>
         <w:rPr>
@@ -11887,7 +11947,7 @@
         <w:t xml:space="preserve">Papers_md/</w:t>
       </w:r>
       <w:r>
-        <w:t xml:space="preserve">, 275 downloaded papers) wherever a corpus match existed; references 1, 8, 9, 10, 16, 17, 19, 21, 22, 23, and 27–47 were verified directly against full-text corpus files (title, author list, venue, and DOI read from the source PDF-derived Markdown, not reconstructed from memory). References 2, 5, 6, 11–15, 18, 20, 24–26 are standard/background citations not present in the local corpus and were not re-verified against primary sources in this pass; author(s) should spot-check these before submission. Reference [7] (the Consensus.app evidence synthesis) is grey literature, not a corpus or peer-reviewed source, and is flagged as such throughout.</w:t>
+        <w:t xml:space="preserve">, 275 downloaded papers) wherever a corpus match existed; references 1, 8, 9, 10, 16, 17, 19, 21, 22, 23, and 27–47 were verified directly against full-text corpus files (title, author list, venue, and DOI read from the source PDF-derived Markdown, not reconstructed from memory). References 2, 5, 6, 11–15, 18, 20, 24–26, 48 are standard/background citations not present in the local corpus and were not re-verified against primary sources in this pass; author(s) should spot-check these before submission (Efron 1979 [48] is a very widely known, unambiguous reference, but was not checked against the corpus since the corpus contains no statistics-methodology papers). Reference [7] (the Consensus.app evidence synthesis) is grey literature, not a corpus or peer-reviewed source, and is flagged as such throughout.</w:t>
       </w:r>
     </w:p>
     <w:p>
@@ -11988,10 +12048,13 @@
           <w:b/>
           <w:bCs/>
         </w:rPr>
-        <w:t xml:space="preserve">Repository URL still pending</w:t>
-      </w:r>
-      <w:r>
-        <w:t xml:space="preserve">, per the author’s explicit choice: the Data Availability Statement placeholder is left as-is (not fabricated) for the author to fill in once the repository is actually public, immediately before submission.</w:t>
+        <w:t xml:space="preserve">Repository URL added:</w:t>
+      </w:r>
+      <w:r>
+        <w:t xml:space="preserve"> </w:t>
+      </w:r>
+      <w:r>
+        <w:t xml:space="preserve">https://github.com/Ajay102456/cc-shap-iot-edge-xai, pushed and public as of this revision. Data Availability Statement updated accordingly.</w:t>
       </w:r>
     </w:p>
     <w:p>

</xml_diff>

<commit_message>
Add MDPI/Sensors camera-ready build (real tabularx tables, citep citations), AI Use Statement update
</commit_message>
<xml_diff>
--- a/submission/manuscript.docx
+++ b/submission/manuscript.docx
@@ -1594,7 +1594,7 @@
         <w:rPr>
           <w:rStyle w:val="VerbatimChar"/>
         </w:rPr>
-        <w:t xml:space="preserve">Attack\_type</w:t>
+        <w:t xml:space="preserve">Attack_type</w:t>
       </w:r>
       <w:r>
         <w:t xml:space="preserve"> </w:t>
@@ -2132,7 +2132,7 @@
         <w:rPr>
           <w:rStyle w:val="VerbatimChar"/>
         </w:rPr>
-        <w:t xml:space="preserve">RLIMIT\_AS</w:t>
+        <w:t xml:space="preserve">RLIMIT_AS</w:t>
       </w:r>
       <w:r>
         <w:t xml:space="preserve">), calibrated to Raspberry Pi 4 (4 cores), Jetson Nano (4 cores), and an unconstrained development-machine baseline. We note, as an honest methodological limitation rather than an implementation detail, that in-process virtual-memory caps below approximately 1.5 GB proved unreliable in our own testing: the baseline footprint of a fresh Python interpreter with NumPy, LightGBM, PyTorch, and SHAP already imported can itself approach or exceed a literal 1 GB budget, causing the underlying native allocator to enter multi-second retry storms rather than failing cleanly. We therefore report simulated-tier results as</w:t>
@@ -8749,7 +8749,16 @@
         <w:pStyle w:val="FirstParagraph"/>
       </w:pPr>
       <w:r>
-        <w:t xml:space="preserve">Large language model-based tools (Claude, Anthropic) were used to assist with code implementation, data analysis scripting, and drafting of this manuscript under direct author supervision and review. All experimental results, figures, and claims were verified by the author(s) against the underlying code and data prior to inclusion. The authors take full responsibility for the content, accuracy, and integrity of this work.</w:t>
+        <w:t xml:space="preserve">Large language model-based tools (Claude, Anthropic) were used to assist with code implementation and execution of the experimental simulations (model training, explainer benchmarking, and the adversarial and ablation test harnesses) under the authors’ direction. The research design, interpretation of results, and manuscript writing are the authors’ own. Both authors independently verified all reported figures, tables, and numerical claims against the underlying code and result files (</w:t>
+      </w:r>
+      <w:r>
+        <w:rPr>
+          <w:rStyle w:val="VerbatimChar"/>
+        </w:rPr>
+        <w:t xml:space="preserve">results/metrics/</w:t>
+      </w:r>
+      <w:r>
+        <w:t xml:space="preserve">) prior to submission. The authors take full responsibility for the content, accuracy, and integrity of this work.</w:t>
       </w:r>
     </w:p>
     <w:p>

</xml_diff>

<commit_message>
Fix two citation errors found via verification (wrong arXiv ID in ref 6, duplicated author in ref 15), add 4 missing DOIs
</commit_message>
<xml_diff>
--- a/submission/manuscript.docx
+++ b/submission/manuscript.docx
@@ -10188,7 +10188,7 @@
         <w:t xml:space="preserve">12</w:t>
       </w:r>
       <w:r>
-        <w:t xml:space="preserve">, 57128–57149.</w:t>
+        <w:t xml:space="preserve">, 57128–57149. https://doi.org/10.1109/ACCESS.2024.3382709</w:t>
       </w:r>
     </w:p>
     <w:p>
@@ -10256,7 +10256,7 @@
         <w:t xml:space="preserve">Four Principles of Explainable Artificial Intelligence</w:t>
       </w:r>
       <w:r>
-        <w:t xml:space="preserve">; NIST Interagency/Internal Report (NISTIR); National Institute of Standards and Technology: Gaithersburg, MD, USA, 2021.</w:t>
+        <w:t xml:space="preserve">; NIST Interagency/Internal Report (NISTIR) 8312; National Institute of Standards and Technology: Gaithersburg, MD, USA, 2021. https://doi.org/10.6028/NIST.IR.8312</w:t>
       </w:r>
     </w:p>
     <w:p>
@@ -10303,7 +10303,7 @@
         <w:t xml:space="preserve">2022</w:t>
       </w:r>
       <w:r>
-        <w:t xml:space="preserve">, arXiv:2203.14196.</w:t>
+        <w:t xml:space="preserve">, arXiv:2207.00007.</w:t>
       </w:r>
     </w:p>
     <w:p>
@@ -10526,7 +10526,7 @@
         <w:t xml:space="preserve">3</w:t>
       </w:r>
       <w:r>
-        <w:t xml:space="preserve">, 1164–1176.</w:t>
+        <w:t xml:space="preserve">, 1164–1176. https://doi.org/10.1109/OJCOMS.2022.3188750</w:t>
       </w:r>
     </w:p>
     <w:p>
@@ -10622,7 +10622,7 @@
         <w:t xml:space="preserve">25</w:t>
       </w:r>
       <w:r>
-        <w:t xml:space="preserve">, 1775–1807.</w:t>
+        <w:t xml:space="preserve">, 1775–1807. https://doi.org/10.1109/COMST.2023.3280465</w:t>
       </w:r>
     </w:p>
     <w:p>
@@ -10682,7 +10682,7 @@
         </w:numPr>
       </w:pPr>
       <w:r>
-        <w:t xml:space="preserve">Bilal, M.; Islam, I.U.; Iltaf, N.; Khan, M.J.; Khan, M.J. Federated Learning With Explainable AI for Malicious Traffic Detection in IoT Networks.</w:t>
+        <w:t xml:space="preserve">Bilal, M.A.; Islam, I.U.; Iltaf, N.; Khan, M.J.; Khan, J. Federated Learning With Explainable AI for Malicious Traffic Detection in IoT Networks.</w:t>
       </w:r>
       <w:r>
         <w:t xml:space="preserve"> </w:t>
@@ -11947,7 +11947,7 @@
         <w:t xml:space="preserve"> </w:t>
       </w:r>
       <w:r>
-        <w:t xml:space="preserve">48 references (47 plus Efron 1979 [48], added during paper-polishing to credit the bootstrap CI method introduced in Section 4.4), cross-checked against the project’s local literature corpus (</w:t>
+        <w:t xml:space="preserve">48 references (47 plus Efron 1979 [48], added during paper-polishing to credit the bootstrap CI method introduced in Section 4.4). References 1, 8, 9, 10, 16, 17, 19, 21, 22, 23, and 27–47 were verified directly against full-text files in the project’s local literature corpus (</w:t>
       </w:r>
       <w:r>
         <w:rPr>
@@ -11956,7 +11956,31 @@
         <w:t xml:space="preserve">Papers_md/</w:t>
       </w:r>
       <w:r>
-        <w:t xml:space="preserve">, 275 downloaded papers) wherever a corpus match existed; references 1, 8, 9, 10, 16, 17, 19, 21, 22, 23, and 27–47 were verified directly against full-text corpus files (title, author list, venue, and DOI read from the source PDF-derived Markdown, not reconstructed from memory). References 2, 5, 6, 11–15, 18, 20, 24–26, 48 are standard/background citations not present in the local corpus and were not re-verified against primary sources in this pass; author(s) should spot-check these before submission (Efron 1979 [48] is a very widely known, unambiguous reference, but was not checked against the corpus since the corpus contains no statistics-methodology papers). Reference [7] (the Consensus.app evidence synthesis) is grey literature, not a corpus or peer-reviewed source, and is flagged as such throughout.</w:t>
+        <w:t xml:space="preserve">, 275 downloaded papers). References 2, 5, 6, 11–15, 18, 20, 24–26 (the ones not in that corpus) were subsequently web-verified individually (title, authors, venue, year, DOI checked against the publisher/arXiv/NIST record) in a later revision pass: 11 of 13 matched exactly; two real errors were found and corrected — ref. [6]’s arXiv ID was wrong (2203.14196 corrected to 2207.00007) and ref. [15]’s author list had a duplicated</w:t>
+      </w:r>
+      <w:r>
+        <w:t xml:space="preserve"> </w:t>
+      </w:r>
+      <w:r>
+        <w:t xml:space="preserve">“Khan, M.J.”</w:t>
+      </w:r>
+      <w:r>
+        <w:t xml:space="preserve"> </w:t>
+      </w:r>
+      <w:r>
+        <w:t xml:space="preserve">where the last author should read</w:t>
+      </w:r>
+      <w:r>
+        <w:t xml:space="preserve"> </w:t>
+      </w:r>
+      <w:r>
+        <w:t xml:space="preserve">“Khan, J.”</w:t>
+      </w:r>
+      <w:r>
+        <w:t xml:space="preserve"> </w:t>
+      </w:r>
+      <w:r>
+        <w:t xml:space="preserve">(Jaleed Khan). Four missing DOIs (refs. 2, 5, 11, 13) were added at the same time. Reference [48] (Efron 1979) and [24]–[26] (Spirtes et al.; DeepFool; LightGBM) are long-established, unambiguous foundational citations, confirmed in the same pass. Reference [7] (the Consensus.app evidence synthesis) is grey literature, not a corpus or peer-reviewed source, and is flagged as such throughout. All 48 references are now independently verified by one of the two methods above.</w:t>
       </w:r>
     </w:p>
     <w:p>

</xml_diff>

<commit_message>
Strip internal status note from manuscript, add cover letter
</commit_message>
<xml_diff>
--- a/submission/manuscript.docx
+++ b/submission/manuscript.docx
@@ -11706,676 +11706,6 @@
         <w:t xml:space="preserve">, 1–26.</w:t>
       </w:r>
     </w:p>
-    <w:p>
-      <w:r>
-        <w:pict>
-          <v:rect style="width:0;height:1.5pt" o:hralign="center" o:hrstd="t" o:hr="t"/>
-        </w:pict>
-      </w:r>
-    </w:p>
-    <w:p>
-      <w:pPr>
-        <w:pStyle w:val="FirstParagraph"/>
-      </w:pPr>
-      <w:r>
-        <w:rPr>
-          <w:b/>
-          <w:bCs/>
-        </w:rPr>
-        <w:t xml:space="preserve">Manuscript status note (remove before submission):</w:t>
-      </w:r>
-    </w:p>
-    <w:p>
-      <w:pPr>
-        <w:pStyle w:val="Compact"/>
-        <w:numPr>
-          <w:ilvl w:val="0"/>
-          <w:numId w:val="1002"/>
-        </w:numPr>
-      </w:pPr>
-      <w:r>
-        <w:rPr>
-          <w:b/>
-          <w:bCs/>
-        </w:rPr>
-        <w:t xml:space="preserve">Target journal:</w:t>
-      </w:r>
-      <w:r>
-        <w:rPr>
-          <w:b/>
-          <w:bCs/>
-        </w:rPr>
-        <w:t xml:space="preserve"> </w:t>
-      </w:r>
-      <w:r>
-        <w:rPr>
-          <w:b/>
-          <w:bCs/>
-          <w:i/>
-          <w:iCs/>
-        </w:rPr>
-        <w:t xml:space="preserve">Sensors</w:t>
-      </w:r>
-      <w:r>
-        <w:rPr>
-          <w:b/>
-          <w:bCs/>
-        </w:rPr>
-        <w:t xml:space="preserve"> </w:t>
-      </w:r>
-      <w:r>
-        <w:rPr>
-          <w:b/>
-          <w:bCs/>
-        </w:rPr>
-        <w:t xml:space="preserve">(MDPI), section</w:t>
-      </w:r>
-      <w:r>
-        <w:rPr>
-          <w:b/>
-          <w:bCs/>
-        </w:rPr>
-        <w:t xml:space="preserve"> </w:t>
-      </w:r>
-      <w:r>
-        <w:rPr>
-          <w:b/>
-          <w:bCs/>
-        </w:rPr>
-        <w:t xml:space="preserve">“Sensor Networks”</w:t>
-      </w:r>
-      <w:r>
-        <w:rPr>
-          <w:b/>
-          <w:bCs/>
-        </w:rPr>
-        <w:t xml:space="preserve"> </w:t>
-      </w:r>
-      <w:r>
-        <w:rPr>
-          <w:b/>
-          <w:bCs/>
-        </w:rPr>
-        <w:t xml:space="preserve">/ Internet of Things.</w:t>
-      </w:r>
-      <w:r>
-        <w:t xml:space="preserve"> </w:t>
-      </w:r>
-      <w:r>
-        <w:t xml:space="preserve">Chosen over the alternatives noted in the project README (</w:t>
-      </w:r>
-      <w:r>
-        <w:rPr>
-          <w:i/>
-          <w:iCs/>
-        </w:rPr>
-        <w:t xml:space="preserve">Future Internet</w:t>
-      </w:r>
-      <w:r>
-        <w:t xml:space="preserve">,</w:t>
-      </w:r>
-      <w:r>
-        <w:t xml:space="preserve"> </w:t>
-      </w:r>
-      <w:r>
-        <w:rPr>
-          <w:i/>
-          <w:iCs/>
-        </w:rPr>
-        <w:t xml:space="preserve">IEEE Access</w:t>
-      </w:r>
-      <w:r>
-        <w:t xml:space="preserve">) because: (a) both of this paper’s load-bearing datasets have their canonical or most-cited companion papers in</w:t>
-      </w:r>
-      <w:r>
-        <w:t xml:space="preserve"> </w:t>
-      </w:r>
-      <w:r>
-        <w:rPr>
-          <w:i/>
-          <w:iCs/>
-        </w:rPr>
-        <w:t xml:space="preserve">Sensors</w:t>
-      </w:r>
-      <w:r>
-        <w:t xml:space="preserve"> </w:t>
-      </w:r>
-      <w:r>
-        <w:t xml:space="preserve">(CICIoT2023 itself [9] and the DeepFool-robustness protocol this paper replicates and extends [8]), giving strong topical and editorial fit; (b)</w:t>
-      </w:r>
-      <w:r>
-        <w:t xml:space="preserve"> </w:t>
-      </w:r>
-      <w:r>
-        <w:rPr>
-          <w:i/>
-          <w:iCs/>
-        </w:rPr>
-        <w:t xml:space="preserve">Sensors</w:t>
-      </w:r>
-      <w:r>
-        <w:t xml:space="preserve"> </w:t>
-      </w:r>
-      <w:r>
-        <w:t xml:space="preserve">carries a materially higher impact factor than</w:t>
-      </w:r>
-      <w:r>
-        <w:t xml:space="preserve"> </w:t>
-      </w:r>
-      <w:r>
-        <w:rPr>
-          <w:i/>
-          <w:iCs/>
-        </w:rPr>
-        <w:t xml:space="preserve">Future Internet</w:t>
-      </w:r>
-      <w:r>
-        <w:t xml:space="preserve"> </w:t>
-      </w:r>
-      <w:r>
-        <w:t xml:space="preserve">while remaining realistic for a benchmark-plus-new-method contribution (vs. </w:t>
-      </w:r>
-      <w:r>
-        <w:rPr>
-          <w:i/>
-          <w:iCs/>
-        </w:rPr>
-        <w:t xml:space="preserve">IEEE Access</w:t>
-      </w:r>
-      <w:r>
-        <w:t xml:space="preserve">’s mega-journal format, which is a reasonable fallback but a weaker fit for a paper whose argument depends on a reader following a specific multi-criteria evaluation narrative rather than skimming a broad-scope venue); (c)</w:t>
-      </w:r>
-      <w:r>
-        <w:t xml:space="preserve"> </w:t>
-      </w:r>
-      <w:r>
-        <w:rPr>
-          <w:i/>
-          <w:iCs/>
-        </w:rPr>
-        <w:t xml:space="preserve">Sensors</w:t>
-      </w:r>
-      <w:r>
-        <w:t xml:space="preserve">’ MDPI house format (the template already used throughout this draft: structured Abstract, numbered sections, Data Availability/Ethics/Author Contributions/AI-Use front matter) requires no restructuring.</w:t>
-      </w:r>
-      <w:r>
-        <w:t xml:space="preserve"> </w:t>
-      </w:r>
-      <w:r>
-        <w:rPr>
-          <w:i/>
-          <w:iCs/>
-        </w:rPr>
-        <w:t xml:space="preserve">Future Internet</w:t>
-      </w:r>
-      <w:r>
-        <w:t xml:space="preserve"> </w:t>
-      </w:r>
-      <w:r>
-        <w:t xml:space="preserve">remains a strong fallback given it is Karras et al.’s [1] own venue, if</w:t>
-      </w:r>
-      <w:r>
-        <w:t xml:space="preserve"> </w:t>
-      </w:r>
-      <w:r>
-        <w:rPr>
-          <w:i/>
-          <w:iCs/>
-        </w:rPr>
-        <w:t xml:space="preserve">Sensors</w:t>
-      </w:r>
-      <w:r>
-        <w:t xml:space="preserve">’ scope reviewers judge the paper too XAI-methodology-heavy relative to its sensing/hardware content.</w:t>
-      </w:r>
-    </w:p>
-    <w:p>
-      <w:pPr>
-        <w:pStyle w:val="Compact"/>
-        <w:numPr>
-          <w:ilvl w:val="0"/>
-          <w:numId w:val="1002"/>
-        </w:numPr>
-      </w:pPr>
-      <w:r>
-        <w:rPr>
-          <w:b/>
-          <w:bCs/>
-        </w:rPr>
-        <w:t xml:space="preserve">Citation count:</w:t>
-      </w:r>
-      <w:r>
-        <w:t xml:space="preserve"> </w:t>
-      </w:r>
-      <w:r>
-        <w:t xml:space="preserve">48 references (47 plus Efron 1979 [48], added during paper-polishing to credit the bootstrap CI method introduced in Section 4.4). References 1, 8, 9, 10, 16, 17, 19, 21, 22, 23, and 27–47 were verified directly against full-text files in the project’s local literature corpus (</w:t>
-      </w:r>
-      <w:r>
-        <w:rPr>
-          <w:rStyle w:val="VerbatimChar"/>
-        </w:rPr>
-        <w:t xml:space="preserve">Papers_md/</w:t>
-      </w:r>
-      <w:r>
-        <w:t xml:space="preserve">, 275 downloaded papers). References 2, 5, 6, 11–15, 18, 20, 24–26 (the ones not in that corpus) were subsequently web-verified individually (title, authors, venue, year, DOI checked against the publisher/arXiv/NIST record) in a later revision pass: 11 of 13 matched exactly; two real errors were found and corrected — ref. [6]’s arXiv ID was wrong (2203.14196 corrected to 2207.00007) and ref. [15]’s author list had a duplicated</w:t>
-      </w:r>
-      <w:r>
-        <w:t xml:space="preserve"> </w:t>
-      </w:r>
-      <w:r>
-        <w:t xml:space="preserve">“Khan, M.J.”</w:t>
-      </w:r>
-      <w:r>
-        <w:t xml:space="preserve"> </w:t>
-      </w:r>
-      <w:r>
-        <w:t xml:space="preserve">where the last author should read</w:t>
-      </w:r>
-      <w:r>
-        <w:t xml:space="preserve"> </w:t>
-      </w:r>
-      <w:r>
-        <w:t xml:space="preserve">“Khan, J.”</w:t>
-      </w:r>
-      <w:r>
-        <w:t xml:space="preserve"> </w:t>
-      </w:r>
-      <w:r>
-        <w:t xml:space="preserve">(Jaleed Khan). Four missing DOIs (refs. 2, 5, 11, 13) were added at the same time. Reference [48] (Efron 1979) and [24]–[26] (Spirtes et al.; DeepFool; LightGBM) are long-established, unambiguous foundational citations, confirmed in the same pass. Reference [7] (the Consensus.app evidence synthesis) is grey literature, not a corpus or peer-reviewed source, and is flagged as such throughout. All 48 references are now independently verified by one of the two methods above.</w:t>
-      </w:r>
-    </w:p>
-    <w:p>
-      <w:pPr>
-        <w:pStyle w:val="Compact"/>
-        <w:numPr>
-          <w:ilvl w:val="0"/>
-          <w:numId w:val="1002"/>
-        </w:numPr>
-      </w:pPr>
-      <w:r>
-        <w:rPr>
-          <w:b/>
-          <w:bCs/>
-        </w:rPr>
-        <w:t xml:space="preserve">Length:</w:t>
-      </w:r>
-      <w:r>
-        <w:t xml:space="preserve"> </w:t>
-      </w:r>
-      <w:r>
-        <w:t xml:space="preserve">body text (Introduction through Conclusion, excluding references and front matter) now runs well past the original 20–25-page estimate after this revision’s additions (new Section 4.4 ablation study, Tables 1b/2b/4b/6b/7, Appendix Table A5, and expanded Sections 5.1/5.4/5.5/Conclusion/Abstract). Related Work is now 8 subsections (merged from 9 in response to the proportionality finding), Results is now 4 subsections (4.1–4.4, up from 3), and the manuscript carries 12 main-body tables plus 5 appendix tables and 4 figures. Actual typeset page count should be re-checked after this revision’s additions, since it was already estimated near the top of the requested range before this round of changes added roughly 2,500 further words of genuine new content (not padding) in direct response to peer review; if now too long for</w:t>
-      </w:r>
-      <w:r>
-        <w:t xml:space="preserve"> </w:t>
-      </w:r>
-      <w:r>
-        <w:rPr>
-          <w:i/>
-          <w:iCs/>
-        </w:rPr>
-        <w:t xml:space="preserve">Sensors</w:t>
-      </w:r>
-      <w:r>
-        <w:t xml:space="preserve">’ typical research-article length, the ablation’s full per-cell grid (currently summarized in Table 7) is the most defensible candidate for moving to a supplementary file rather than cutting.</w:t>
-      </w:r>
-    </w:p>
-    <w:p>
-      <w:pPr>
-        <w:pStyle w:val="Compact"/>
-        <w:numPr>
-          <w:ilvl w:val="0"/>
-          <w:numId w:val="1002"/>
-        </w:numPr>
-      </w:pPr>
-      <w:r>
-        <w:rPr>
-          <w:b/>
-          <w:bCs/>
-        </w:rPr>
-        <w:t xml:space="preserve">Author info added:</w:t>
-      </w:r>
-      <w:r>
-        <w:t xml:space="preserve"> </w:t>
-      </w:r>
-      <w:r>
-        <w:t xml:space="preserve">Subarmaniam Kannan (corresponding author, ORCID 0000-0002-0049-4747) and Sumendra Yogarayan (ORCID 0000-0002-5151-2300), both affiliated with the Faculty of Information Science and Technology (FIST) and the Centre of Intelligent Cloud Computing (CICC), Multimedia University, Melaka, Malaysia, per the author-info file supplied (a third author, Samuel Ong Li Kang, was in that file but removed from the byline at the user’s request). Author Contributions, per the user’s instruction: both authors contributed equally across all roles except Conceptualization, which is attributed solely to S.K. Figures are referenced by their generated file paths under</w:t>
-      </w:r>
-      <w:r>
-        <w:t xml:space="preserve"> </w:t>
-      </w:r>
-      <w:r>
-        <w:rPr>
-          <w:rStyle w:val="VerbatimChar"/>
-        </w:rPr>
-        <w:t xml:space="preserve">results/figures/</w:t>
-      </w:r>
-      <w:r>
-        <w:t xml:space="preserve">; embed as submission-ready figure files per</w:t>
-      </w:r>
-      <w:r>
-        <w:t xml:space="preserve"> </w:t>
-      </w:r>
-      <w:r>
-        <w:rPr>
-          <w:i/>
-          <w:iCs/>
-        </w:rPr>
-        <w:t xml:space="preserve">Sensors</w:t>
-      </w:r>
-      <w:r>
-        <w:t xml:space="preserve"> </w:t>
-      </w:r>
-      <w:r>
-        <w:t xml:space="preserve">formatting requirements before submission.</w:t>
-      </w:r>
-    </w:p>
-    <w:p>
-      <w:pPr>
-        <w:pStyle w:val="Compact"/>
-        <w:numPr>
-          <w:ilvl w:val="0"/>
-          <w:numId w:val="1002"/>
-        </w:numPr>
-      </w:pPr>
-      <w:r>
-        <w:rPr>
-          <w:b/>
-          <w:bCs/>
-        </w:rPr>
-        <w:t xml:space="preserve">Repository URL added:</w:t>
-      </w:r>
-      <w:r>
-        <w:t xml:space="preserve"> </w:t>
-      </w:r>
-      <w:r>
-        <w:t xml:space="preserve">https://github.com/Ajay102456/cc-shap-iot-edge-xai, pushed and public as of this revision. Data Availability Statement updated accordingly.</w:t>
-      </w:r>
-    </w:p>
-    <w:p>
-      <w:pPr>
-        <w:pStyle w:val="Compact"/>
-        <w:numPr>
-          <w:ilvl w:val="0"/>
-          <w:numId w:val="1002"/>
-        </w:numPr>
-      </w:pPr>
-      <w:r>
-        <w:rPr>
-          <w:b/>
-          <w:bCs/>
-        </w:rPr>
-        <w:t xml:space="preserve">Peer-review response (this revision):</w:t>
-      </w:r>
-      <w:r>
-        <w:t xml:space="preserve"> </w:t>
-      </w:r>
-      <w:r>
-        <w:t xml:space="preserve">a simulated 5-reviewer panel (Journal-Fit, Methodology, Domain, Perspective, Devil’s Advocate) identified five must-address issues and three should-address issues; this revision addresses all eight with real, newly-run experiments rather than text-only responses:</w:t>
-      </w:r>
-    </w:p>
-    <w:p>
-      <w:pPr>
-        <w:pStyle w:val="Compact"/>
-        <w:numPr>
-          <w:ilvl w:val="1"/>
-          <w:numId w:val="1003"/>
-        </w:numPr>
-      </w:pPr>
-      <w:r>
-        <w:rPr>
-          <w:i/>
-          <w:iCs/>
-        </w:rPr>
-        <w:t xml:space="preserve">Missing ablation (Devil’s Advocate CRITICAL / Methodology MAJOR)</w:t>
-      </w:r>
-      <w:r>
-        <w:t xml:space="preserve">: added</w:t>
-      </w:r>
-      <w:r>
-        <w:t xml:space="preserve"> </w:t>
-      </w:r>
-      <w:r>
-        <w:rPr>
-          <w:rStyle w:val="VerbatimChar"/>
-        </w:rPr>
-        <w:t xml:space="preserve">src/ablation_causal.py</w:t>
-      </w:r>
-      <w:r>
-        <w:t xml:space="preserve"> </w:t>
-      </w:r>
-      <w:r>
-        <w:t xml:space="preserve">and new Section 4.4, testing whether CC-SHAP’s sparsity/robustness advantage requires its causal skeleton specifically or merely forced consolidation. Finding, reported exactly as obtained: at production sample size the significance-based skeleton collapses to one all-encompassing clique (mathematically identical to simple order-0 correlation thresholding), so a sparser effect-size-threshold skeleton was built to get a genuine test; correlation-informed grouping beats size-matched random grouping on sparsity in all four (dataset, model) cells tested, and on robustness for the LightGBM/TreeSHAP side, but</w:t>
-      </w:r>
-      <w:r>
-        <w:t xml:space="preserve"> </w:t>
-      </w:r>
-      <w:r>
-        <w:rPr>
-          <w:i/>
-          <w:iCs/>
-        </w:rPr>
-        <w:t xml:space="preserve">loses</w:t>
-      </w:r>
-      <w:r>
-        <w:t xml:space="preserve"> </w:t>
-      </w:r>
-      <w:r>
-        <w:t xml:space="preserve">to random grouping on robustness for the MLP/KernelSHAP side, a real, model-dependent reversal, not an artifact, reported as such rather than averaged away. This is the single most consequential finding added in this revision and reframes</w:t>
-      </w:r>
-      <w:r>
-        <w:t xml:space="preserve"> </w:t>
-      </w:r>
-      <w:r>
-        <w:t xml:space="preserve">“causal”</w:t>
-      </w:r>
-      <w:r>
-        <w:t xml:space="preserve"> </w:t>
-      </w:r>
-      <w:r>
-        <w:t xml:space="preserve">to</w:t>
-      </w:r>
-      <w:r>
-        <w:t xml:space="preserve"> </w:t>
-      </w:r>
-      <w:r>
-        <w:t xml:space="preserve">“correlation-informed”</w:t>
-      </w:r>
-      <w:r>
-        <w:t xml:space="preserve"> </w:t>
-      </w:r>
-      <w:r>
-        <w:t xml:space="preserve">in several places where the stronger word was not earned by the evidence actually presented.</w:t>
-      </w:r>
-    </w:p>
-    <w:p>
-      <w:pPr>
-        <w:pStyle w:val="Compact"/>
-        <w:numPr>
-          <w:ilvl w:val="1"/>
-          <w:numId w:val="1003"/>
-        </w:numPr>
-      </w:pPr>
-      <w:r>
-        <w:rPr>
-          <w:i/>
-          <w:iCs/>
-        </w:rPr>
-        <w:t xml:space="preserve">No variance/CI reporting (Methodology CRITICAL)</w:t>
-      </w:r>
-      <w:r>
-        <w:t xml:space="preserve">: added bootstrap 95% CIs (Table 2b) from an independently-seeded companion run, confirming the CC-SHAP-vs-KernelSHAP fidelity gap is real (non-overlapping CIs) while softening</w:t>
-      </w:r>
-      <w:r>
-        <w:t xml:space="preserve"> </w:t>
-      </w:r>
-      <w:r>
-        <w:t xml:space="preserve">“near-statistical-tie”</w:t>
-      </w:r>
-      <w:r>
-        <w:t xml:space="preserve"> </w:t>
-      </w:r>
-      <w:r>
-        <w:t xml:space="preserve">language around the 0.005 UMCEF_IoT composite gap (Table 3), which was never actually CI-backed.</w:t>
-      </w:r>
-    </w:p>
-    <w:p>
-      <w:pPr>
-        <w:pStyle w:val="Compact"/>
-        <w:numPr>
-          <w:ilvl w:val="1"/>
-          <w:numId w:val="1003"/>
-        </w:numPr>
-      </w:pPr>
-      <w:r>
-        <w:rPr>
-          <w:i/>
-          <w:iCs/>
-        </w:rPr>
-        <w:t xml:space="preserve">Resource-tier breakdown missing from the manuscript body (Methodology MAJOR)</w:t>
-      </w:r>
-      <w:r>
-        <w:t xml:space="preserve">: added Tables 1b and 4b, extracted from the already-computed production CSVs (no new experiment needed).</w:t>
-      </w:r>
-    </w:p>
-    <w:p>
-      <w:pPr>
-        <w:pStyle w:val="Compact"/>
-        <w:numPr>
-          <w:ilvl w:val="1"/>
-          <w:numId w:val="1003"/>
-        </w:numPr>
-      </w:pPr>
-      <w:r>
-        <w:rPr>
-          <w:i/>
-          <w:iCs/>
-        </w:rPr>
-        <w:t xml:space="preserve">Top-</w:t>
-      </w:r>
-      <w:r>
-        <w:t xml:space="preserve">k* / sparsity metric interaction undisclosed (Methodology MAJOR)</w:t>
-      </w:r>
-      <w:r>
-        <w:rPr>
-          <w:i/>
-          <w:iCs/>
-        </w:rPr>
-        <w:t xml:space="preserve">: added an explicit paragraph in Section 3.6 stating</w:t>
-      </w:r>
-      <w:r>
-        <w:rPr>
-          <w:i/>
-          <w:iCs/>
-        </w:rPr>
-        <w:t xml:space="preserve"> </w:t>
-      </w:r>
-      <w:r>
-        <w:t xml:space="preserve">k* = 5, noting CC-SHAP’s active-feature count is typically smaller than</w:t>
-      </w:r>
-      <w:r>
-        <w:t xml:space="preserve"> </w:t>
-      </w:r>
-      <w:r>
-        <w:rPr>
-          <w:i/>
-          <w:iCs/>
-        </w:rPr>
-        <w:t xml:space="preserve">k</w:t>
-      </w:r>
-      <w:r>
-        <w:t xml:space="preserve">, and pointing to the Section 4.4 matched-sparsity comparison as a partial control.</w:t>
-      </w:r>
-    </w:p>
-    <w:p>
-      <w:pPr>
-        <w:pStyle w:val="Compact"/>
-        <w:numPr>
-          <w:ilvl w:val="1"/>
-          <w:numId w:val="1003"/>
-        </w:numPr>
-      </w:pPr>
-      <w:r>
-        <w:rPr>
-          <w:i/>
-          <w:iCs/>
-        </w:rPr>
-        <w:t xml:space="preserve">Placeholder repository URL (Journal-Fit MAJOR)</w:t>
-      </w:r>
-      <w:r>
-        <w:t xml:space="preserve">: left as an honest placeholder per the author’s explicit choice (see above), not fabricated.</w:t>
-      </w:r>
-    </w:p>
-    <w:p>
-      <w:pPr>
-        <w:pStyle w:val="Compact"/>
-        <w:numPr>
-          <w:ilvl w:val="1"/>
-          <w:numId w:val="1003"/>
-        </w:numPr>
-      </w:pPr>
-      <w:r>
-        <w:rPr>
-          <w:i/>
-          <w:iCs/>
-        </w:rPr>
-        <w:t xml:space="preserve">UMCEF_IoT weighting sensitivity (Perspective MAJOR)</w:t>
-      </w:r>
-      <w:r>
-        <w:t xml:space="preserve">: added Table 6b (four weighting schemes, both datasets, computed directly from existing component scores); CC-SHAP never falls below 3rd of 5 and leads outright under equal or robustness-dominant weighting.</w:t>
-      </w:r>
-    </w:p>
-    <w:p>
-      <w:pPr>
-        <w:pStyle w:val="Compact"/>
-        <w:numPr>
-          <w:ilvl w:val="1"/>
-          <w:numId w:val="1003"/>
-        </w:numPr>
-      </w:pPr>
-      <w:r>
-        <w:rPr>
-          <w:i/>
-          <w:iCs/>
-        </w:rPr>
-        <w:t xml:space="preserve">Related Work proportionality (Journal-Fit MAJOR)</w:t>
-      </w:r>
-      <w:r>
-        <w:t xml:space="preserve">: merged the thinnest subsection (former 2.7, 96 words) into the Datasets subsection it was already adjacent to in topic; citation count and substantive content unchanged, subsection count reduced 9 → 8.</w:t>
-      </w:r>
-    </w:p>
-    <w:p>
-      <w:pPr>
-        <w:pStyle w:val="Compact"/>
-        <w:numPr>
-          <w:ilvl w:val="1"/>
-          <w:numId w:val="1003"/>
-        </w:numPr>
-      </w:pPr>
-      <w:r>
-        <w:rPr>
-          <w:i/>
-          <w:iCs/>
-        </w:rPr>
-        <w:t xml:space="preserve">Clique-size distribution unreported (Methodology MINOR)</w:t>
-      </w:r>
-      <w:r>
-        <w:t xml:space="preserve">: now reported directly in Section 4.4 and the released</w:t>
-      </w:r>
-      <w:r>
-        <w:t xml:space="preserve"> </w:t>
-      </w:r>
-      <w:r>
-        <w:rPr>
-          <w:rStyle w:val="VerbatimChar"/>
-        </w:rPr>
-        <w:t xml:space="preserve">results/metrics/cliques_*.txt</w:t>
-      </w:r>
-      <w:r>
-        <w:t xml:space="preserve"> </w:t>
-      </w:r>
-      <w:r>
-        <w:t xml:space="preserve">files; this is also what surfaced finding #1 above.</w:t>
-      </w:r>
-    </w:p>
     <w:bookmarkEnd w:id="69"/>
     <w:bookmarkEnd w:id="70"/>
     <w:sectPr>
@@ -12573,146 +11903,10 @@
       </w:pPr>
     </w:lvl>
   </w:abstractNum>
-  <w:abstractNum w:abstractNumId="991">
-    <w:nsid w:val="0000A991"/>
-    <w:multiLevelType w:val="multilevel"/>
-    <w:lvl w:ilvl="0">
-      <w:numFmt w:val="bullet"/>
-      <w:lvlText w:val=""/>
-      <w:lvlJc w:val="left"/>
-      <w:pPr>
-        <w:ind w:left="720" w:hanging="360"/>
-      </w:pPr>
-      <w:rPr>
-        <w:rFonts w:ascii="Symbol" w:hAnsi="Symbol" w:cs="Symbol" w:hint="default"/>
-      </w:rPr>
-    </w:lvl>
-    <w:lvl w:ilvl="1">
-      <w:numFmt w:val="bullet"/>
-      <w:lvlText w:val="o"/>
-      <w:lvlJc w:val="left"/>
-      <w:pPr>
-        <w:ind w:left="1440" w:hanging="360"/>
-      </w:pPr>
-      <w:rPr>
-        <w:rFonts w:ascii="Courier New" w:hAnsi="Courier New" w:cs="Courier New" w:hint="default"/>
-      </w:rPr>
-    </w:lvl>
-    <w:lvl w:ilvl="2">
-      <w:numFmt w:val="bullet"/>
-      <w:lvlText w:val=""/>
-      <w:lvlJc w:val="left"/>
-      <w:pPr>
-        <w:ind w:left="2160" w:hanging="360"/>
-      </w:pPr>
-      <w:rPr>
-        <w:rFonts w:ascii="Wingdings" w:hAnsi="Wingdings" w:cs="Wingdings" w:hint="default"/>
-      </w:rPr>
-    </w:lvl>
-    <w:lvl w:ilvl="3">
-      <w:numFmt w:val="bullet"/>
-      <w:lvlText w:val=""/>
-      <w:lvlJc w:val="left"/>
-      <w:pPr>
-        <w:ind w:left="2880" w:hanging="360"/>
-      </w:pPr>
-      <w:rPr>
-        <w:rFonts w:ascii="Symbol" w:hAnsi="Symbol" w:cs="Symbol" w:hint="default"/>
-      </w:rPr>
-    </w:lvl>
-    <w:lvl w:ilvl="4">
-      <w:numFmt w:val="bullet"/>
-      <w:lvlText w:val="o"/>
-      <w:lvlJc w:val="left"/>
-      <w:pPr>
-        <w:ind w:left="3600" w:hanging="360"/>
-      </w:pPr>
-      <w:rPr>
-        <w:rFonts w:ascii="Courier New" w:hAnsi="Courier New" w:cs="Courier New" w:hint="default"/>
-      </w:rPr>
-    </w:lvl>
-    <w:lvl w:ilvl="5">
-      <w:numFmt w:val="bullet"/>
-      <w:lvlText w:val=""/>
-      <w:lvlJc w:val="left"/>
-      <w:pPr>
-        <w:ind w:left="4320" w:hanging="360"/>
-      </w:pPr>
-      <w:rPr>
-        <w:rFonts w:ascii="Wingdings" w:hAnsi="Wingdings" w:cs="Wingdings" w:hint="default"/>
-      </w:rPr>
-    </w:lvl>
-    <w:lvl w:ilvl="6">
-      <w:numFmt w:val="bullet"/>
-      <w:lvlText w:val=""/>
-      <w:lvlJc w:val="left"/>
-      <w:pPr>
-        <w:ind w:left="5040" w:hanging="360"/>
-      </w:pPr>
-      <w:rPr>
-        <w:rFonts w:ascii="Symbol" w:hAnsi="Symbol" w:cs="Symbol" w:hint="default"/>
-      </w:rPr>
-    </w:lvl>
-    <w:lvl w:ilvl="7">
-      <w:numFmt w:val="bullet"/>
-      <w:lvlText w:val="o"/>
-      <w:lvlJc w:val="left"/>
-      <w:pPr>
-        <w:ind w:left="5760" w:hanging="360"/>
-      </w:pPr>
-      <w:rPr>
-        <w:rFonts w:ascii="Courier New" w:hAnsi="Courier New" w:cs="Courier New" w:hint="default"/>
-      </w:rPr>
-    </w:lvl>
-    <w:lvl w:ilvl="8">
-      <w:numFmt w:val="bullet"/>
-      <w:lvlText w:val=""/>
-      <w:lvlJc w:val="left"/>
-      <w:pPr>
-        <w:ind w:left="6480" w:hanging="360"/>
-      </w:pPr>
-      <w:rPr>
-        <w:rFonts w:ascii="Wingdings" w:hAnsi="Wingdings" w:cs="Wingdings" w:hint="default"/>
-      </w:rPr>
-    </w:lvl>
-  </w:abstractNum>
   <w:num w:numId="1000">
     <w:abstractNumId w:val="990"/>
   </w:num>
   <w:num w:numId="1001">
-    <w:abstractNumId w:val="99411"/>
-    <w:lvlOverride w:ilvl="0">
-      <w:startOverride w:val="1"/>
-    </w:lvlOverride>
-    <w:lvlOverride w:ilvl="1">
-      <w:startOverride w:val="1"/>
-    </w:lvlOverride>
-    <w:lvlOverride w:ilvl="2">
-      <w:startOverride w:val="1"/>
-    </w:lvlOverride>
-    <w:lvlOverride w:ilvl="3">
-      <w:startOverride w:val="1"/>
-    </w:lvlOverride>
-    <w:lvlOverride w:ilvl="4">
-      <w:startOverride w:val="1"/>
-    </w:lvlOverride>
-    <w:lvlOverride w:ilvl="5">
-      <w:startOverride w:val="1"/>
-    </w:lvlOverride>
-    <w:lvlOverride w:ilvl="6">
-      <w:startOverride w:val="1"/>
-    </w:lvlOverride>
-    <w:lvlOverride w:ilvl="7">
-      <w:startOverride w:val="1"/>
-    </w:lvlOverride>
-    <w:lvlOverride w:ilvl="8">
-      <w:startOverride w:val="1"/>
-    </w:lvlOverride>
-  </w:num>
-  <w:num w:numId="1002">
-    <w:abstractNumId w:val="991"/>
-  </w:num>
-  <w:num w:numId="1003">
     <w:abstractNumId w:val="99411"/>
     <w:lvlOverride w:ilvl="0">
       <w:startOverride w:val="1"/>

</xml_diff>